<commit_message>
Kiralama form no akışı ve teslim tutanağı alan eşleştirmeleri güncellendi
</commit_message>
<xml_diff>
--- a/app/static/templates/Teslim_Tutanagi_TASLAK.docx
+++ b/app/static/templates/Teslim_Tutanagi_TASLAK.docx
@@ -52,6 +52,24 @@
       <w:proofErr w:type="gramEnd"/>
       <w:r>
         <w:t xml:space="preserve">} </w:t>
+      </w:r>
+      <w:r>
+        <w:tab/>
+      </w:r>
+      <w:r>
+        <w:tab/>
+      </w:r>
+      <w:r>
+        <w:tab/>
+      </w:r>
+      <w:r>
+        <w:tab/>
+      </w:r>
+      <w:r>
+        <w:tab/>
+      </w:r>
+      <w:r>
+        <w:tab/>
       </w:r>
       <w:r>
         <w:rPr>
@@ -807,7 +825,7 @@
                               <w:tblLook w:val="04A0" w:firstRow="1" w:lastRow="0" w:firstColumn="1" w:lastColumn="0" w:noHBand="0" w:noVBand="1"/>
                             </w:tblPr>
                             <w:tblGrid>
-                              <w:gridCol w:w="3496"/>
+                              <w:gridCol w:w="1530"/>
                             </w:tblGrid>
                             <w:tr>
                               <w:trPr>
@@ -846,22 +864,6 @@
                                       <w:bCs/>
                                     </w:rPr>
                                     <w:t xml:space="preserve"> </w:t>
-                                  </w:r>
-                                  <w:proofErr w:type="gramStart"/>
-                                  <w:r>
-                                    <w:t xml:space="preserve">{{ </w:t>
-                                  </w:r>
-                                  <w:proofErr w:type="spellStart"/>
-                                  <w:r>
-                                    <w:t>musteri</w:t>
-                                  </w:r>
-                                  <w:proofErr w:type="gramEnd"/>
-                                  <w:r>
-                                    <w:t>_unvan</w:t>
-                                  </w:r>
-                                  <w:proofErr w:type="spellEnd"/>
-                                  <w:r>
-                                    <w:t xml:space="preserve"> }}</w:t>
                                   </w:r>
                                 </w:p>
                               </w:tc>
@@ -980,7 +982,7 @@
                         <w:tblLook w:val="04A0" w:firstRow="1" w:lastRow="0" w:firstColumn="1" w:lastColumn="0" w:noHBand="0" w:noVBand="1"/>
                       </w:tblPr>
                       <w:tblGrid>
-                        <w:gridCol w:w="3496"/>
+                        <w:gridCol w:w="1530"/>
                       </w:tblGrid>
                       <w:tr>
                         <w:trPr>
@@ -1019,22 +1021,6 @@
                                 <w:bCs/>
                               </w:rPr>
                               <w:t xml:space="preserve"> </w:t>
-                            </w:r>
-                            <w:proofErr w:type="gramStart"/>
-                            <w:r>
-                              <w:t xml:space="preserve">{{ </w:t>
-                            </w:r>
-                            <w:proofErr w:type="spellStart"/>
-                            <w:r>
-                              <w:t>musteri</w:t>
-                            </w:r>
-                            <w:proofErr w:type="gramEnd"/>
-                            <w:r>
-                              <w:t>_unvan</w:t>
-                            </w:r>
-                            <w:proofErr w:type="spellEnd"/>
-                            <w:r>
-                              <w:t xml:space="preserve"> }}</w:t>
                             </w:r>
                           </w:p>
                         </w:tc>
@@ -1500,45 +1486,6 @@
               </w:rPr>
             </w:pPr>
           </w:p>
-        </w:tc>
-      </w:tr>
-      <w:tr>
-        <w:trPr>
-          <w:tblCellSpacing w:w="15" w:type="dxa"/>
-        </w:trPr>
-        <w:tc>
-          <w:tcPr>
-            <w:tcW w:w="0" w:type="auto"/>
-            <w:vAlign w:val="center"/>
-            <w:hideMark/>
-          </w:tcPr>
-          <w:p/>
-        </w:tc>
-      </w:tr>
-      <w:tr>
-        <w:trPr>
-          <w:tblCellSpacing w:w="15" w:type="dxa"/>
-        </w:trPr>
-        <w:tc>
-          <w:tcPr>
-            <w:tcW w:w="0" w:type="auto"/>
-            <w:vAlign w:val="center"/>
-            <w:hideMark/>
-          </w:tcPr>
-          <w:p/>
-        </w:tc>
-      </w:tr>
-      <w:tr>
-        <w:trPr>
-          <w:tblCellSpacing w:w="15" w:type="dxa"/>
-        </w:trPr>
-        <w:tc>
-          <w:tcPr>
-            <w:tcW w:w="0" w:type="auto"/>
-            <w:vAlign w:val="center"/>
-            <w:hideMark/>
-          </w:tcPr>
-          <w:p/>
         </w:tc>
       </w:tr>
       <w:tr>

</xml_diff>

<commit_message>
Form ve şablon tasarımları güncellendi
</commit_message>
<xml_diff>
--- a/app/static/templates/Teslim_Tutanagi_TASLAK.docx
+++ b/app/static/templates/Teslim_Tutanagi_TASLAK.docx
@@ -123,7 +123,7 @@
     </w:p>
     <w:tbl>
       <w:tblPr>
-        <w:tblW w:w="0" w:type="auto"/>
+        <w:tblW w:w="9923" w:type="dxa"/>
         <w:tblCellSpacing w:w="15" w:type="dxa"/>
         <w:tblCellMar>
           <w:top w:w="15" w:type="dxa"/>
@@ -135,7 +135,7 @@
       </w:tblPr>
       <w:tblGrid>
         <w:gridCol w:w="2538"/>
-        <w:gridCol w:w="2775"/>
+        <w:gridCol w:w="7385"/>
       </w:tblGrid>
       <w:tr>
         <w:trPr>
@@ -158,7 +158,7 @@
         </w:tc>
         <w:tc>
           <w:tcPr>
-            <w:tcW w:w="2730" w:type="dxa"/>
+            <w:tcW w:w="7340" w:type="dxa"/>
             <w:vAlign w:val="center"/>
           </w:tcPr>
           <w:p>
@@ -209,7 +209,7 @@
         </w:tc>
         <w:tc>
           <w:tcPr>
-            <w:tcW w:w="2730" w:type="dxa"/>
+            <w:tcW w:w="7340" w:type="dxa"/>
             <w:tcBorders>
               <w:top w:val="single" w:sz="4" w:space="0" w:color="auto"/>
               <w:left w:val="single" w:sz="4" w:space="0" w:color="auto"/>
@@ -268,7 +268,7 @@
         </w:tc>
         <w:tc>
           <w:tcPr>
-            <w:tcW w:w="2730" w:type="dxa"/>
+            <w:tcW w:w="7340" w:type="dxa"/>
             <w:tcBorders>
               <w:top w:val="single" w:sz="4" w:space="0" w:color="auto"/>
               <w:left w:val="single" w:sz="4" w:space="0" w:color="auto"/>
@@ -300,7 +300,7 @@
       </w:tr>
       <w:tr>
         <w:trPr>
-          <w:trHeight w:val="1131"/>
+          <w:trHeight w:val="554"/>
           <w:tblCellSpacing w:w="15" w:type="dxa"/>
         </w:trPr>
         <w:tc>
@@ -327,7 +327,7 @@
         </w:tc>
         <w:tc>
           <w:tcPr>
-            <w:tcW w:w="2730" w:type="dxa"/>
+            <w:tcW w:w="7340" w:type="dxa"/>
             <w:tcBorders>
               <w:top w:val="single" w:sz="4" w:space="0" w:color="auto"/>
               <w:left w:val="single" w:sz="4" w:space="0" w:color="auto"/>

</xml_diff>